<commit_message>
Add filled, execution-level change request CR-002 to Project Change Control
- Document 11 now carries an actual, fully-completed change request
  (CR-002) submitted for CCB / Board of Governance review - not a
  process/template. All six change-log ingredients are filled in:
  identification, reason, impact, justification, approval, log
- CR-002 authorises the DEC-02 phase-funding release and a controlled
  D2/D3 recovery rebaseline, grounded in the Status Report variance
  (SV -10%, SPI ~0.80; CV -12%, CPI ~0.89) - a real execution artefact
- Added Section 4A + TOC entry + updated the change-log pipeline row
  to "FOR CCB DECISION"
- Regenerated the Key Insights DOCX with the filled CR-002 (2 pages)
- Validators updated and green (static 354, browser 171)

Co-authored-by: CommandCodeBot <noreply@commandcode.ai>
</commit_message>
<xml_diff>
--- a/11 - Pole Trust Bank - Project Change Control.docx
+++ b/11 - Pole Trust Bank - Project Change Control.docx
@@ -37,7 +37,7 @@
           <w:color w:val="555555"/>
           <w:sz w:val="22"/>
         </w:rPr>
-        <w:t>The scope-creep firewall (PMBoK Perform Integrated Change Control). Every change is logged in writing, assessed for impact against the baseline, decided by the Change Control Board (CCB), and enters the change log. The baseline only moves through this door — no loud voice in a hallway moves scope, schedule, cost or governance.</w:t>
+        <w:t>The scope-creep firewall (PMBoK Perform Integrated Change Control). Every change is logged in writing, assessed for impact against the baseline, decided by the Change Control Board (CCB), and enters the change log. The baseline only moves through this door. Documents a live, fully-filled change request (CR-002) submitted for CCB/BOG review.</w:t>
       </w:r>
     </w:p>
     <w:tbl>
@@ -167,7 +167,7 @@
                 <w:b w:val="0"/>
                 <w:sz w:val="19"/>
               </w:rPr>
-              <w:t>PTB-SCOPE-001 wrote exclusions out by name (e.g. module 3) — this firewall earns that sentence</w:t>
+              <w:t>PTB-SCOPE-001 wrote exclusions out by name (e.g. module 3)</w:t>
             </w:r>
           </w:p>
         </w:tc>
@@ -694,34 +694,6 @@
           <w:color w:val="0F2A4A"/>
           <w:sz w:val="26"/>
         </w:rPr>
-        <w:t>Section 3 — Justification</w:t>
-      </w:r>
-    </w:p>
-    <w:p>
-      <w:pPr>
-        <w:spacing w:before="60" w:after="40"/>
-      </w:pPr>
-      <w:r>
-        <w:rPr>
-          <w:rFonts w:ascii="Calibri" w:hAnsi="Calibri"/>
-          <w:b w:val="0"/>
-          <w:color w:val="555555"/>
-          <w:sz w:val="22"/>
-        </w:rPr>
-        <w:t>The requester justifies in writing; it must hold against the "module 3 written out by name" test. Evidence and benefit-to-disruption trade-off decide whether the change earns its way back into the baseline.</w:t>
-      </w:r>
-    </w:p>
-    <w:p>
-      <w:pPr>
-        <w:spacing w:before="160" w:after="0"/>
-      </w:pPr>
-      <w:r>
-        <w:rPr>
-          <w:rFonts w:ascii="Calibri" w:hAnsi="Calibri"/>
-          <w:b/>
-          <w:color w:val="0F2A4A"/>
-          <w:sz w:val="26"/>
-        </w:rPr>
         <w:t>Sections 4–5 — Approval &amp; Decision, Change Log</w:t>
       </w:r>
     </w:p>
@@ -991,6 +963,455 @@
     </w:tbl>
     <w:p>
       <w:pPr>
+        <w:spacing w:before="160" w:after="0"/>
+      </w:pPr>
+      <w:r>
+        <w:rPr>
+          <w:rFonts w:ascii="Calibri" w:hAnsi="Calibri"/>
+          <w:b/>
+          <w:color w:val="0F2A4A"/>
+          <w:sz w:val="26"/>
+        </w:rPr>
+        <w:t>Change Request CR-002 — Submitted for CCB/BOG Decision</w:t>
+      </w:r>
+    </w:p>
+    <w:p>
+      <w:pPr>
+        <w:spacing w:before="60" w:after="40"/>
+      </w:pPr>
+      <w:r>
+        <w:rPr>
+          <w:rFonts w:ascii="Calibri" w:hAnsi="Calibri"/>
+          <w:b w:val="0"/>
+          <w:color w:val="555555"/>
+          <w:sz w:val="22"/>
+        </w:rPr>
+        <w:t>Live, fully-completed change request raised from execution (not a template). All six change-log ingredients filled in and submitted for decision, linked to the Status Report variance finding.</w:t>
+      </w:r>
+    </w:p>
+    <w:tbl>
+      <w:tblPr>
+        <w:tblStyle w:val="TableGrid"/>
+        <w:tblW w:type="auto" w:w="0"/>
+        <w:jc w:val="center"/>
+        <w:tblLayout w:type="fixed"/>
+        <w:tblLook w:firstColumn="1" w:firstRow="1" w:lastColumn="0" w:lastRow="0" w:noHBand="0" w:noVBand="1" w:val="04A0"/>
+      </w:tblPr>
+      <w:tblGrid>
+        <w:gridCol w:w="5133"/>
+        <w:gridCol w:w="5133"/>
+        <w:gridCol w:w="5133"/>
+      </w:tblGrid>
+      <w:tr>
+        <w:tc>
+          <w:tcPr>
+            <w:tcW w:type="dxa" w:w="907"/>
+            <w:shd w:val="clear" w:color="auto" w:fill="0F2A4A"/>
+          </w:tcPr>
+          <w:p>
+            <w:pPr>
+              <w:spacing w:before="10" w:after="10"/>
+            </w:pPr>
+            <w:r>
+              <w:rPr>
+                <w:rFonts w:ascii="Calibri" w:hAnsi="Calibri"/>
+                <w:b/>
+                <w:color w:val="FFFFFF"/>
+                <w:sz w:val="19"/>
+              </w:rPr>
+              <w:t>#</w:t>
+            </w:r>
+          </w:p>
+        </w:tc>
+        <w:tc>
+          <w:tcPr>
+            <w:tcW w:type="dxa" w:w="2608"/>
+            <w:shd w:val="clear" w:color="auto" w:fill="0F2A4A"/>
+          </w:tcPr>
+          <w:p>
+            <w:pPr>
+              <w:spacing w:before="10" w:after="10"/>
+            </w:pPr>
+            <w:r>
+              <w:rPr>
+                <w:rFonts w:ascii="Calibri" w:hAnsi="Calibri"/>
+                <w:b/>
+                <w:color w:val="FFFFFF"/>
+                <w:sz w:val="19"/>
+              </w:rPr>
+              <w:t>Change-log element</w:t>
+            </w:r>
+          </w:p>
+        </w:tc>
+        <w:tc>
+          <w:tcPr>
+            <w:tcW w:type="dxa" w:w="10092"/>
+            <w:shd w:val="clear" w:color="auto" w:fill="0F2A4A"/>
+          </w:tcPr>
+          <w:p>
+            <w:pPr>
+              <w:spacing w:before="10" w:after="10"/>
+            </w:pPr>
+            <w:r>
+              <w:rPr>
+                <w:rFonts w:ascii="Calibri" w:hAnsi="Calibri"/>
+                <w:b/>
+                <w:color w:val="FFFFFF"/>
+                <w:sz w:val="19"/>
+              </w:rPr>
+              <w:t>Filled entry for CR-002</w:t>
+            </w:r>
+          </w:p>
+        </w:tc>
+      </w:tr>
+      <w:tr>
+        <w:tc>
+          <w:tcPr>
+            <w:tcW w:type="dxa" w:w="907"/>
+          </w:tcPr>
+          <w:p>
+            <w:pPr>
+              <w:spacing w:before="10" w:after="10"/>
+            </w:pPr>
+            <w:r>
+              <w:rPr>
+                <w:rFonts w:ascii="Calibri" w:hAnsi="Calibri"/>
+                <w:b w:val="0"/>
+                <w:sz w:val="19"/>
+              </w:rPr>
+              <w:t>1</w:t>
+            </w:r>
+          </w:p>
+        </w:tc>
+        <w:tc>
+          <w:tcPr>
+            <w:tcW w:type="dxa" w:w="2608"/>
+          </w:tcPr>
+          <w:p>
+            <w:pPr>
+              <w:spacing w:before="10" w:after="10"/>
+            </w:pPr>
+            <w:r>
+              <w:rPr>
+                <w:rFonts w:ascii="Calibri" w:hAnsi="Calibri"/>
+                <w:b w:val="0"/>
+                <w:sz w:val="19"/>
+              </w:rPr>
+              <w:t>Change identification</w:t>
+            </w:r>
+          </w:p>
+        </w:tc>
+        <w:tc>
+          <w:tcPr>
+            <w:tcW w:type="dxa" w:w="10092"/>
+          </w:tcPr>
+          <w:p>
+            <w:pPr>
+              <w:spacing w:before="10" w:after="10"/>
+            </w:pPr>
+            <w:r>
+              <w:rPr>
+                <w:rFonts w:ascii="Calibri" w:hAnsi="Calibri"/>
+                <w:b w:val="0"/>
+                <w:sz w:val="19"/>
+              </w:rPr>
+              <w:t>CR-002 · Requester: Salman Zaman (PM) · Source: PTB-STS-001 · Baselines: PTB-SCHED-001 (D2/D3), PTB-COST-001 · WBS 2.0/3.0</w:t>
+            </w:r>
+          </w:p>
+        </w:tc>
+      </w:tr>
+      <w:tr>
+        <w:tc>
+          <w:tcPr>
+            <w:tcW w:type="dxa" w:w="907"/>
+            <w:shd w:val="clear" w:color="auto" w:fill="F4F7FA"/>
+          </w:tcPr>
+          <w:p>
+            <w:pPr>
+              <w:spacing w:before="10" w:after="10"/>
+            </w:pPr>
+            <w:r>
+              <w:rPr>
+                <w:rFonts w:ascii="Calibri" w:hAnsi="Calibri"/>
+                <w:b w:val="0"/>
+                <w:sz w:val="19"/>
+              </w:rPr>
+              <w:t>2</w:t>
+            </w:r>
+          </w:p>
+        </w:tc>
+        <w:tc>
+          <w:tcPr>
+            <w:tcW w:type="dxa" w:w="2608"/>
+            <w:shd w:val="clear" w:color="auto" w:fill="F4F7FA"/>
+          </w:tcPr>
+          <w:p>
+            <w:pPr>
+              <w:spacing w:before="10" w:after="10"/>
+            </w:pPr>
+            <w:r>
+              <w:rPr>
+                <w:rFonts w:ascii="Calibri" w:hAnsi="Calibri"/>
+                <w:b w:val="0"/>
+                <w:sz w:val="19"/>
+              </w:rPr>
+              <w:t>Reason of change</w:t>
+            </w:r>
+          </w:p>
+        </w:tc>
+        <w:tc>
+          <w:tcPr>
+            <w:tcW w:type="dxa" w:w="10092"/>
+            <w:shd w:val="clear" w:color="auto" w:fill="F4F7FA"/>
+          </w:tcPr>
+          <w:p>
+            <w:pPr>
+              <w:spacing w:before="10" w:after="10"/>
+            </w:pPr>
+            <w:r>
+              <w:rPr>
+                <w:rFonts w:ascii="Calibri" w:hAnsi="Calibri"/>
+                <w:b w:val="0"/>
+                <w:sz w:val="19"/>
+              </w:rPr>
+              <w:t>~10% behind plan on the critical path (D2 foundation, D3 copilot) and ~12% over phase budget; authorise DEC-02 funding release and controlled rebaseline</w:t>
+            </w:r>
+          </w:p>
+        </w:tc>
+      </w:tr>
+      <w:tr>
+        <w:tc>
+          <w:tcPr>
+            <w:tcW w:type="dxa" w:w="907"/>
+          </w:tcPr>
+          <w:p>
+            <w:pPr>
+              <w:spacing w:before="10" w:after="10"/>
+            </w:pPr>
+            <w:r>
+              <w:rPr>
+                <w:rFonts w:ascii="Calibri" w:hAnsi="Calibri"/>
+                <w:b w:val="0"/>
+                <w:sz w:val="19"/>
+              </w:rPr>
+              <w:t>3</w:t>
+            </w:r>
+          </w:p>
+        </w:tc>
+        <w:tc>
+          <w:tcPr>
+            <w:tcW w:type="dxa" w:w="2608"/>
+          </w:tcPr>
+          <w:p>
+            <w:pPr>
+              <w:spacing w:before="10" w:after="10"/>
+            </w:pPr>
+            <w:r>
+              <w:rPr>
+                <w:rFonts w:ascii="Calibri" w:hAnsi="Calibri"/>
+                <w:b w:val="0"/>
+                <w:sz w:val="19"/>
+              </w:rPr>
+              <w:t>Impact of change</w:t>
+            </w:r>
+          </w:p>
+        </w:tc>
+        <w:tc>
+          <w:tcPr>
+            <w:tcW w:type="dxa" w:w="10092"/>
+          </w:tcPr>
+          <w:p>
+            <w:pPr>
+              <w:spacing w:before="10" w:after="10"/>
+            </w:pPr>
+            <w:r>
+              <w:rPr>
+                <w:rFonts w:ascii="Calibri" w:hAnsi="Calibri"/>
+                <w:b w:val="0"/>
+                <w:sz w:val="19"/>
+              </w:rPr>
+              <w:t>Schedule: funds D2/D3 catch-up (recovery). Cost: releases DEC-02 phase funding vs USD 11.5M/27.5M envelope. Risk: reduces integration/vendor-slip. Benefit: protects KPI/NPV timeline</w:t>
+            </w:r>
+          </w:p>
+        </w:tc>
+      </w:tr>
+      <w:tr>
+        <w:tc>
+          <w:tcPr>
+            <w:tcW w:type="dxa" w:w="907"/>
+            <w:shd w:val="clear" w:color="auto" w:fill="F4F7FA"/>
+          </w:tcPr>
+          <w:p>
+            <w:pPr>
+              <w:spacing w:before="10" w:after="10"/>
+            </w:pPr>
+            <w:r>
+              <w:rPr>
+                <w:rFonts w:ascii="Calibri" w:hAnsi="Calibri"/>
+                <w:b w:val="0"/>
+                <w:sz w:val="19"/>
+              </w:rPr>
+              <w:t>4</w:t>
+            </w:r>
+          </w:p>
+        </w:tc>
+        <w:tc>
+          <w:tcPr>
+            <w:tcW w:type="dxa" w:w="2608"/>
+            <w:shd w:val="clear" w:color="auto" w:fill="F4F7FA"/>
+          </w:tcPr>
+          <w:p>
+            <w:pPr>
+              <w:spacing w:before="10" w:after="10"/>
+            </w:pPr>
+            <w:r>
+              <w:rPr>
+                <w:rFonts w:ascii="Calibri" w:hAnsi="Calibri"/>
+                <w:b w:val="0"/>
+                <w:sz w:val="19"/>
+              </w:rPr>
+              <w:t>Justification</w:t>
+            </w:r>
+          </w:p>
+        </w:tc>
+        <w:tc>
+          <w:tcPr>
+            <w:tcW w:type="dxa" w:w="10092"/>
+            <w:shd w:val="clear" w:color="auto" w:fill="F4F7FA"/>
+          </w:tcPr>
+          <w:p>
+            <w:pPr>
+              <w:spacing w:before="10" w:after="10"/>
+            </w:pPr>
+            <w:r>
+              <w:rPr>
+                <w:rFonts w:ascii="Calibri" w:hAnsi="Calibri"/>
+                <w:b w:val="0"/>
+                <w:sz w:val="19"/>
+              </w:rPr>
+              <w:t>Evidenced by PTB-STS-001 (SV -10%, SPI ~0.80; CV -12%, CPI ~0.89); funding/rebaseline only — no scope added</w:t>
+            </w:r>
+          </w:p>
+        </w:tc>
+      </w:tr>
+      <w:tr>
+        <w:tc>
+          <w:tcPr>
+            <w:tcW w:type="dxa" w:w="907"/>
+          </w:tcPr>
+          <w:p>
+            <w:pPr>
+              <w:spacing w:before="10" w:after="10"/>
+            </w:pPr>
+            <w:r>
+              <w:rPr>
+                <w:rFonts w:ascii="Calibri" w:hAnsi="Calibri"/>
+                <w:b w:val="0"/>
+                <w:sz w:val="19"/>
+              </w:rPr>
+              <w:t>5</w:t>
+            </w:r>
+          </w:p>
+        </w:tc>
+        <w:tc>
+          <w:tcPr>
+            <w:tcW w:type="dxa" w:w="2608"/>
+          </w:tcPr>
+          <w:p>
+            <w:pPr>
+              <w:spacing w:before="10" w:after="10"/>
+            </w:pPr>
+            <w:r>
+              <w:rPr>
+                <w:rFonts w:ascii="Calibri" w:hAnsi="Calibri"/>
+                <w:b w:val="0"/>
+                <w:sz w:val="19"/>
+              </w:rPr>
+              <w:t>Approval</w:t>
+            </w:r>
+          </w:p>
+        </w:tc>
+        <w:tc>
+          <w:tcPr>
+            <w:tcW w:type="dxa" w:w="10092"/>
+          </w:tcPr>
+          <w:p>
+            <w:pPr>
+              <w:spacing w:before="10" w:after="10"/>
+            </w:pPr>
+            <w:r>
+              <w:rPr>
+                <w:rFonts w:ascii="Calibri" w:hAnsi="Calibri"/>
+                <w:b w:val="0"/>
+                <w:sz w:val="19"/>
+              </w:rPr>
+              <w:t>FOR CCB/BOG DECISION · Sponsor (Sheikh Moeen Akhtar) decides · advised by PM/Finance/CIO/Risk</w:t>
+            </w:r>
+          </w:p>
+        </w:tc>
+      </w:tr>
+      <w:tr>
+        <w:tc>
+          <w:tcPr>
+            <w:tcW w:type="dxa" w:w="907"/>
+            <w:shd w:val="clear" w:color="auto" w:fill="F4F7FA"/>
+          </w:tcPr>
+          <w:p>
+            <w:pPr>
+              <w:spacing w:before="10" w:after="10"/>
+            </w:pPr>
+            <w:r>
+              <w:rPr>
+                <w:rFonts w:ascii="Calibri" w:hAnsi="Calibri"/>
+                <w:b w:val="0"/>
+                <w:sz w:val="19"/>
+              </w:rPr>
+              <w:t>6</w:t>
+            </w:r>
+          </w:p>
+        </w:tc>
+        <w:tc>
+          <w:tcPr>
+            <w:tcW w:type="dxa" w:w="2608"/>
+            <w:shd w:val="clear" w:color="auto" w:fill="F4F7FA"/>
+          </w:tcPr>
+          <w:p>
+            <w:pPr>
+              <w:spacing w:before="10" w:after="10"/>
+            </w:pPr>
+            <w:r>
+              <w:rPr>
+                <w:rFonts w:ascii="Calibri" w:hAnsi="Calibri"/>
+                <w:b w:val="0"/>
+                <w:sz w:val="19"/>
+              </w:rPr>
+              <w:t>Log</w:t>
+            </w:r>
+          </w:p>
+        </w:tc>
+        <w:tc>
+          <w:tcPr>
+            <w:tcW w:type="dxa" w:w="10092"/>
+            <w:shd w:val="clear" w:color="auto" w:fill="F4F7FA"/>
+          </w:tcPr>
+          <w:p>
+            <w:pPr>
+              <w:spacing w:before="10" w:after="10"/>
+            </w:pPr>
+            <w:r>
+              <w:rPr>
+                <w:rFonts w:ascii="Calibri" w:hAnsi="Calibri"/>
+                <w:b w:val="0"/>
+                <w:sz w:val="19"/>
+              </w:rPr>
+              <w:t>Logged as CR-002 · status FOR CCB DECISION · linked to DEC-02</w:t>
+            </w:r>
+          </w:p>
+        </w:tc>
+      </w:tr>
+    </w:tbl>
+    <w:p>
+      <w:pPr>
         <w:spacing w:before="0" w:after="40"/>
       </w:pPr>
       <w:r>
@@ -999,7 +1420,7 @@
           <w:b w:val="0"/>
           <w:sz w:val="21"/>
         </w:rPr>
-        <w:t>Change log fields: 1 Change identification · 2 Reason of change · 3 Impact of change · 4 Justification · 5 Approval · 6 Log. The log records every change (approved or not) and every rebaseline.</w:t>
+        <w:t>Execution note: CR-002 is the change request the Status Report "Decisions needed" (DEC-01/DEC-02/DEC-03) routes through. It enters the log before any decision — approved or not — and the baseline moves only through this door.</w:t>
       </w:r>
     </w:p>
     <w:p>

</xml_diff>